<commit_message>
changes to cv docs
</commit_message>
<xml_diff>
--- a/Jon_Huggins_CV.docx
+++ b/Jon_Huggins_CV.docx
@@ -40,14 +40,16 @@
         </w:tabs>
         <w:spacing w:after="20"/>
       </w:pPr>
-      <w:r>
-        <w:rPr>
-          <w:color w:val="1A7A7A"/>
-          <w:sz w:val="19"/>
-          <w:szCs w:val="19"/>
-        </w:rPr>
-        <w:t>jlhuggins@protonmail.com</w:t>
-      </w:r>
+      <w:hyperlink r:id="rId5" w:history="1">
+        <w:r>
+          <w:rPr>
+            <w:rStyle w:val="Hyperlink"/>
+            <w:sz w:val="19"/>
+            <w:szCs w:val="19"/>
+          </w:rPr>
+          <w:t>jlhuggins@protonmail.com</w:t>
+        </w:r>
+      </w:hyperlink>
       <w:r>
         <w:rPr>
           <w:color w:val="444444"/>
@@ -81,22 +83,24 @@
         </w:rPr>
         <w:tab/>
       </w:r>
-      <w:r>
-        <w:rPr>
-          <w:color w:val="1A7A7A"/>
-          <w:sz w:val="19"/>
-          <w:szCs w:val="19"/>
-        </w:rPr>
-        <w:t>https://</w:t>
-      </w:r>
-      <w:r>
-        <w:rPr>
-          <w:color w:val="1A7A7A"/>
-          <w:sz w:val="19"/>
-          <w:szCs w:val="19"/>
-        </w:rPr>
-        <w:t>jonhuggins.nz</w:t>
-      </w:r>
+      <w:hyperlink r:id="rId6" w:history="1">
+        <w:r>
+          <w:rPr>
+            <w:rStyle w:val="Hyperlink"/>
+            <w:sz w:val="19"/>
+            <w:szCs w:val="19"/>
+          </w:rPr>
+          <w:t>https://</w:t>
+        </w:r>
+        <w:r>
+          <w:rPr>
+            <w:rStyle w:val="Hyperlink"/>
+            <w:sz w:val="19"/>
+            <w:szCs w:val="19"/>
+          </w:rPr>
+          <w:t>jonhuggins.nz</w:t>
+        </w:r>
+      </w:hyperlink>
     </w:p>
     <w:p>
       <w:pPr>
@@ -2204,6 +2208,18 @@
       <w:shd w:val="clear" w:color="auto" w:fill="E1DFDD"/>
     </w:rPr>
   </w:style>
+  <w:style w:type="character" w:styleId="FollowedHyperlink">
+    <w:name w:val="FollowedHyperlink"/>
+    <w:basedOn w:val="DefaultParagraphFont"/>
+    <w:uiPriority w:val="99"/>
+    <w:semiHidden/>
+    <w:unhideWhenUsed/>
+    <w:rsid w:val="00B126E7"/>
+    <w:rPr>
+      <w:color w:val="96607D" w:themeColor="followedHyperlink"/>
+      <w:u w:val="single"/>
+    </w:rPr>
+  </w:style>
 </w:styles>
 </file>
 

</xml_diff>